<commit_message>
Correction mise en page
</commit_message>
<xml_diff>
--- a/Cours/5eme/SaintExupery/Chapitre_13/Documents/Chapitre 13 - Proportionnalité (A trou).docx
+++ b/Cours/5eme/SaintExupery/Chapitre_13/Documents/Chapitre 13 - Proportionnalité (A trou).docx
@@ -1580,13 +1580,7 @@
                   <w:rPr>
                     <w:rFonts w:ascii="Cambria Math" w:hAnsi="Cambria Math"/>
                   </w:rPr>
-                  <m:t>=</m:t>
-                </m:r>
-                <m:r>
-                  <w:rPr>
-                    <w:rFonts w:ascii="Cambria Math" w:hAnsi="Cambria Math"/>
-                  </w:rPr>
-                  <m:t xml:space="preserve">           </m:t>
+                  <m:t xml:space="preserve">=           </m:t>
                 </m:r>
               </m:oMath>
             </m:oMathPara>
@@ -1699,13 +1693,7 @@
                   <w:rPr>
                     <w:rFonts w:ascii="Cambria Math" w:hAnsi="Cambria Math"/>
                   </w:rPr>
-                  <m:t>=</m:t>
-                </m:r>
-                <m:r>
-                  <w:rPr>
-                    <w:rFonts w:ascii="Cambria Math" w:hAnsi="Cambria Math"/>
-                  </w:rPr>
-                  <m:t xml:space="preserve">            </m:t>
+                  <m:t xml:space="preserve">=            </m:t>
                 </m:r>
               </m:oMath>
             </m:oMathPara>
@@ -1758,13 +1746,7 @@
                   <w:rPr>
                     <w:rFonts w:ascii="Cambria Math" w:hAnsi="Cambria Math"/>
                   </w:rPr>
-                  <m:t>=</m:t>
-                </m:r>
-                <m:r>
-                  <w:rPr>
-                    <w:rFonts w:ascii="Cambria Math" w:hAnsi="Cambria Math"/>
-                  </w:rPr>
-                  <m:t xml:space="preserve">            </m:t>
+                  <m:t xml:space="preserve">=            </m:t>
                 </m:r>
               </m:oMath>
             </m:oMathPara>
@@ -2494,7 +2476,7 @@
     </w:p>
     <w:p>
       <w:pPr>
-        <w:spacing w:before="240"/>
+        <w:spacing w:before="240" w:after="0"/>
       </w:pPr>
       <w:r>
         <w:t>Le prix d'une quantité de pomme est proportionnel à la masse de pomme :</w:t>
@@ -3438,10 +3420,7 @@
         <w:t xml:space="preserve">         </w:t>
       </w:r>
       <w:r>
-        <w:t xml:space="preserve"> </w:t>
-      </w:r>
-      <w:r>
-        <w:t>g de sucre.</w:t>
+        <w:t xml:space="preserve"> g de sucre.</w:t>
       </w:r>
     </w:p>
     <w:p>
@@ -6932,21 +6911,7 @@
         <w:rPr>
           <w:rFonts w:eastAsiaTheme="minorEastAsia"/>
         </w:rPr>
-        <w:t xml:space="preserve"> </w:t>
-      </w:r>
-      <w:proofErr w:type="gramStart"/>
-      <w:r>
-        <w:rPr>
-          <w:rFonts w:eastAsiaTheme="minorEastAsia"/>
-        </w:rPr>
-        <w:t>est</w:t>
-      </w:r>
-      <w:proofErr w:type="gramEnd"/>
-      <w:r>
-        <w:rPr>
-          <w:rFonts w:eastAsiaTheme="minorEastAsia"/>
-        </w:rPr>
-        <w:t xml:space="preserve"> identique à </w:t>
+        <w:t xml:space="preserve"> est identique à </w:t>
       </w:r>
       <m:oMath>
         <m:r>

</xml_diff>